<commit_message>
docs(resume): remove Delivery Driver entry, expand operational scope, and maintain clean horizontal section dividers on 1 full page
</commit_message>
<xml_diff>
--- a/public/brand/Landen_Jackson_Master_Divider_Resume.docx
+++ b/public/brand/Landen_Jackson_Master_Divider_Resume.docx
@@ -4,7 +4,7 @@
   <w:body>
     <w:p>
       <w:pPr>
-        <w:spacing w:before="0" w:after="10" w:line="250" w:lineRule="auto"/>
+        <w:spacing w:before="0" w:after="20" w:line="269" w:lineRule="auto"/>
         <w:jc w:val="center"/>
       </w:pPr>
       <w:r>
@@ -12,14 +12,14 @@
           <w:rFonts w:ascii="Arial" w:hAnsi="Arial"/>
           <w:b/>
           <w:color w:val="000000"/>
-          <w:sz w:val="33"/>
+          <w:sz w:val="34"/>
         </w:rPr>
         <w:t>LANDEN JACKSON</w:t>
       </w:r>
     </w:p>
     <w:p>
       <w:pPr>
-        <w:spacing w:before="0" w:after="20" w:line="250" w:lineRule="auto"/>
+        <w:spacing w:before="0" w:after="30" w:line="269" w:lineRule="auto"/>
         <w:jc w:val="center"/>
       </w:pPr>
       <w:r>
@@ -34,7 +34,7 @@
     </w:p>
     <w:p>
       <w:pPr>
-        <w:spacing w:before="0" w:after="40" w:line="250" w:lineRule="auto"/>
+        <w:spacing w:before="0" w:after="50" w:line="269" w:lineRule="auto"/>
         <w:jc w:val="center"/>
       </w:pPr>
       <w:r>
@@ -54,12 +54,12 @@
         <w:tblLook w:firstColumn="1" w:firstRow="1" w:lastColumn="0" w:lastRow="0" w:noHBand="0" w:noVBand="1" w:val="04A0"/>
       </w:tblPr>
       <w:tblGrid>
-        <w:gridCol w:w="10858"/>
+        <w:gridCol w:w="10742"/>
       </w:tblGrid>
       <w:tr>
         <w:tc>
           <w:tcPr>
-            <w:tcW w:type="dxa" w:w="10858"/>
+            <w:tcW w:type="dxa" w:w="10742"/>
             <w:tcBorders>
               <w:top w:val="none"/>
               <w:left w:val="none"/>
@@ -88,7 +88,7 @@
     </w:tbl>
     <w:p>
       <w:pPr>
-        <w:spacing w:before="60" w:after="20" w:line="250" w:lineRule="auto"/>
+        <w:spacing w:before="90" w:after="30" w:line="269" w:lineRule="auto"/>
       </w:pPr>
       <w:r>
         <w:rPr>
@@ -108,12 +108,12 @@
         <w:tblLook w:firstColumn="1" w:firstRow="1" w:lastColumn="0" w:lastRow="0" w:noHBand="0" w:noVBand="1" w:val="04A0"/>
       </w:tblPr>
       <w:tblGrid>
-        <w:gridCol w:w="10858"/>
+        <w:gridCol w:w="10742"/>
       </w:tblGrid>
       <w:tr>
         <w:tc>
           <w:tcPr>
-            <w:tcW w:type="dxa" w:w="10858"/>
+            <w:tcW w:type="dxa" w:w="10742"/>
             <w:tcBorders>
               <w:top w:val="none"/>
               <w:left w:val="none"/>
@@ -142,7 +142,7 @@
     </w:tbl>
     <w:p>
       <w:pPr>
-        <w:spacing w:before="30" w:after="40" w:line="254" w:lineRule="auto"/>
+        <w:spacing w:before="40" w:after="60" w:line="274" w:lineRule="auto"/>
       </w:pPr>
       <w:r>
         <w:rPr>
@@ -155,7 +155,7 @@
     </w:p>
     <w:p>
       <w:pPr>
-        <w:spacing w:before="60" w:after="20" w:line="250" w:lineRule="auto"/>
+        <w:spacing w:before="90" w:after="30" w:line="269" w:lineRule="auto"/>
       </w:pPr>
       <w:r>
         <w:rPr>
@@ -175,12 +175,12 @@
         <w:tblLook w:firstColumn="1" w:firstRow="1" w:lastColumn="0" w:lastRow="0" w:noHBand="0" w:noVBand="1" w:val="04A0"/>
       </w:tblPr>
       <w:tblGrid>
-        <w:gridCol w:w="10858"/>
+        <w:gridCol w:w="10742"/>
       </w:tblGrid>
       <w:tr>
         <w:tc>
           <w:tcPr>
-            <w:tcW w:type="dxa" w:w="10858"/>
+            <w:tcW w:type="dxa" w:w="10742"/>
             <w:tcBorders>
               <w:top w:val="none"/>
               <w:left w:val="none"/>
@@ -209,7 +209,7 @@
     </w:tbl>
     <w:p>
       <w:pPr>
-        <w:spacing w:before="10" w:after="20" w:line="252" w:lineRule="auto"/>
+        <w:spacing w:before="20" w:after="36" w:line="269" w:lineRule="auto"/>
         <w:ind w:left="259" w:hanging="259"/>
       </w:pPr>
       <w:r>
@@ -241,7 +241,7 @@
     </w:p>
     <w:p>
       <w:pPr>
-        <w:spacing w:before="10" w:after="20" w:line="252" w:lineRule="auto"/>
+        <w:spacing w:before="20" w:after="36" w:line="269" w:lineRule="auto"/>
         <w:ind w:left="259" w:hanging="259"/>
       </w:pPr>
       <w:r>
@@ -273,7 +273,7 @@
     </w:p>
     <w:p>
       <w:pPr>
-        <w:spacing w:before="10" w:after="20" w:line="252" w:lineRule="auto"/>
+        <w:spacing w:before="20" w:after="36" w:line="269" w:lineRule="auto"/>
         <w:ind w:left="259" w:hanging="259"/>
       </w:pPr>
       <w:r>
@@ -305,7 +305,7 @@
     </w:p>
     <w:p>
       <w:pPr>
-        <w:spacing w:before="60" w:after="20" w:line="250" w:lineRule="auto"/>
+        <w:spacing w:before="90" w:after="30" w:line="269" w:lineRule="auto"/>
       </w:pPr>
       <w:r>
         <w:rPr>
@@ -325,12 +325,12 @@
         <w:tblLook w:firstColumn="1" w:firstRow="1" w:lastColumn="0" w:lastRow="0" w:noHBand="0" w:noVBand="1" w:val="04A0"/>
       </w:tblPr>
       <w:tblGrid>
-        <w:gridCol w:w="10858"/>
+        <w:gridCol w:w="10742"/>
       </w:tblGrid>
       <w:tr>
         <w:tc>
           <w:tcPr>
-            <w:tcW w:type="dxa" w:w="10858"/>
+            <w:tcW w:type="dxa" w:w="10742"/>
             <w:tcBorders>
               <w:top w:val="none"/>
               <w:left w:val="none"/>
@@ -365,13 +365,13 @@
         <w:tblLook w:firstColumn="1" w:firstRow="1" w:lastColumn="0" w:lastRow="0" w:noHBand="0" w:noVBand="1" w:val="04A0"/>
       </w:tblPr>
       <w:tblGrid>
-        <w:gridCol w:w="7848"/>
-        <w:gridCol w:w="3010"/>
+        <w:gridCol w:w="7776"/>
+        <w:gridCol w:w="2966"/>
       </w:tblGrid>
       <w:tr>
         <w:tc>
           <w:tcPr>
-            <w:tcW w:type="dxa" w:w="5429"/>
+            <w:tcW w:type="dxa" w:w="5371"/>
             <w:tcBorders>
               <w:top w:val="none"/>
               <w:left w:val="none"/>
@@ -387,7 +387,7 @@
           </w:tcPr>
           <w:p>
             <w:pPr>
-              <w:spacing w:before="40" w:after="10" w:line="250" w:lineRule="auto"/>
+              <w:spacing w:before="60" w:after="10" w:line="269" w:lineRule="auto"/>
             </w:pPr>
             <w:r>
               <w:rPr>
@@ -402,7 +402,7 @@
         </w:tc>
         <w:tc>
           <w:tcPr>
-            <w:tcW w:type="dxa" w:w="5429"/>
+            <w:tcW w:type="dxa" w:w="5371"/>
             <w:tcBorders>
               <w:top w:val="none"/>
               <w:left w:val="none"/>
@@ -418,7 +418,7 @@
           </w:tcPr>
           <w:p>
             <w:pPr>
-              <w:spacing w:before="40" w:after="10" w:line="250" w:lineRule="auto"/>
+              <w:spacing w:before="60" w:after="10" w:line="269" w:lineRule="auto"/>
               <w:jc w:val="right"/>
             </w:pPr>
             <w:r>
@@ -436,7 +436,7 @@
     </w:tbl>
     <w:p>
       <w:pPr>
-        <w:spacing w:before="10" w:after="20" w:line="250" w:lineRule="auto"/>
+        <w:spacing w:before="10" w:after="30" w:line="269" w:lineRule="auto"/>
       </w:pPr>
       <w:r>
         <w:rPr>
@@ -450,7 +450,7 @@
     </w:p>
     <w:p>
       <w:pPr>
-        <w:spacing w:before="10" w:after="20" w:line="252" w:lineRule="auto"/>
+        <w:spacing w:before="20" w:after="36" w:line="269" w:lineRule="auto"/>
         <w:ind w:left="259" w:hanging="259"/>
       </w:pPr>
       <w:r>
@@ -473,7 +473,7 @@
     </w:p>
     <w:p>
       <w:pPr>
-        <w:spacing w:before="10" w:after="20" w:line="252" w:lineRule="auto"/>
+        <w:spacing w:before="20" w:after="36" w:line="269" w:lineRule="auto"/>
         <w:ind w:left="259" w:hanging="259"/>
       </w:pPr>
       <w:r>
@@ -496,7 +496,7 @@
     </w:p>
     <w:p>
       <w:pPr>
-        <w:spacing w:before="10" w:after="20" w:line="252" w:lineRule="auto"/>
+        <w:spacing w:before="20" w:after="36" w:line="269" w:lineRule="auto"/>
         <w:ind w:left="259" w:hanging="259"/>
       </w:pPr>
       <w:r>
@@ -519,7 +519,7 @@
     </w:p>
     <w:p>
       <w:pPr>
-        <w:spacing w:before="60" w:after="20" w:line="250" w:lineRule="auto"/>
+        <w:spacing w:before="90" w:after="30" w:line="269" w:lineRule="auto"/>
       </w:pPr>
       <w:r>
         <w:rPr>
@@ -539,12 +539,12 @@
         <w:tblLook w:firstColumn="1" w:firstRow="1" w:lastColumn="0" w:lastRow="0" w:noHBand="0" w:noVBand="1" w:val="04A0"/>
       </w:tblPr>
       <w:tblGrid>
-        <w:gridCol w:w="10858"/>
+        <w:gridCol w:w="10742"/>
       </w:tblGrid>
       <w:tr>
         <w:tc>
           <w:tcPr>
-            <w:tcW w:type="dxa" w:w="10858"/>
+            <w:tcW w:type="dxa" w:w="10742"/>
             <w:tcBorders>
               <w:top w:val="none"/>
               <w:left w:val="none"/>
@@ -579,13 +579,13 @@
         <w:tblLook w:firstColumn="1" w:firstRow="1" w:lastColumn="0" w:lastRow="0" w:noHBand="0" w:noVBand="1" w:val="04A0"/>
       </w:tblPr>
       <w:tblGrid>
-        <w:gridCol w:w="7848"/>
-        <w:gridCol w:w="3010"/>
+        <w:gridCol w:w="7776"/>
+        <w:gridCol w:w="2966"/>
       </w:tblGrid>
       <w:tr>
         <w:tc>
           <w:tcPr>
-            <w:tcW w:type="dxa" w:w="5429"/>
+            <w:tcW w:type="dxa" w:w="5371"/>
             <w:tcBorders>
               <w:top w:val="none"/>
               <w:left w:val="none"/>
@@ -601,7 +601,7 @@
           </w:tcPr>
           <w:p>
             <w:pPr>
-              <w:spacing w:before="40" w:after="10" w:line="250" w:lineRule="auto"/>
+              <w:spacing w:before="60" w:after="10" w:line="269" w:lineRule="auto"/>
             </w:pPr>
             <w:r>
               <w:rPr>
@@ -616,7 +616,7 @@
         </w:tc>
         <w:tc>
           <w:tcPr>
-            <w:tcW w:type="dxa" w:w="5429"/>
+            <w:tcW w:type="dxa" w:w="5371"/>
             <w:tcBorders>
               <w:top w:val="none"/>
               <w:left w:val="none"/>
@@ -632,7 +632,7 @@
           </w:tcPr>
           <w:p>
             <w:pPr>
-              <w:spacing w:before="40" w:after="10" w:line="250" w:lineRule="auto"/>
+              <w:spacing w:before="60" w:after="10" w:line="269" w:lineRule="auto"/>
               <w:jc w:val="right"/>
             </w:pPr>
             <w:r>
@@ -650,7 +650,7 @@
     </w:tbl>
     <w:p>
       <w:pPr>
-        <w:spacing w:before="10" w:after="20" w:line="250" w:lineRule="auto"/>
+        <w:spacing w:before="10" w:after="30" w:line="269" w:lineRule="auto"/>
       </w:pPr>
       <w:r>
         <w:rPr>
@@ -664,7 +664,7 @@
     </w:p>
     <w:p>
       <w:pPr>
-        <w:spacing w:before="10" w:after="20" w:line="252" w:lineRule="auto"/>
+        <w:spacing w:before="20" w:after="36" w:line="269" w:lineRule="auto"/>
         <w:ind w:left="259" w:hanging="259"/>
       </w:pPr>
       <w:r>
@@ -687,7 +687,7 @@
     </w:p>
     <w:p>
       <w:pPr>
-        <w:spacing w:before="10" w:after="20" w:line="252" w:lineRule="auto"/>
+        <w:spacing w:before="20" w:after="36" w:line="269" w:lineRule="auto"/>
         <w:ind w:left="259" w:hanging="259"/>
       </w:pPr>
       <w:r>
@@ -710,7 +710,7 @@
     </w:p>
     <w:p>
       <w:pPr>
-        <w:spacing w:before="10" w:after="20" w:line="252" w:lineRule="auto"/>
+        <w:spacing w:before="20" w:after="36" w:line="269" w:lineRule="auto"/>
         <w:ind w:left="259" w:hanging="259"/>
       </w:pPr>
       <w:r>
@@ -733,7 +733,7 @@
     </w:p>
     <w:p>
       <w:pPr>
-        <w:spacing w:before="10" w:after="20" w:line="252" w:lineRule="auto"/>
+        <w:spacing w:before="20" w:after="36" w:line="269" w:lineRule="auto"/>
         <w:ind w:left="259" w:hanging="259"/>
       </w:pPr>
       <w:r>
@@ -762,13 +762,13 @@
         <w:tblLook w:firstColumn="1" w:firstRow="1" w:lastColumn="0" w:lastRow="0" w:noHBand="0" w:noVBand="1" w:val="04A0"/>
       </w:tblPr>
       <w:tblGrid>
-        <w:gridCol w:w="7848"/>
-        <w:gridCol w:w="3010"/>
+        <w:gridCol w:w="7776"/>
+        <w:gridCol w:w="2966"/>
       </w:tblGrid>
       <w:tr>
         <w:tc>
           <w:tcPr>
-            <w:tcW w:type="dxa" w:w="5429"/>
+            <w:tcW w:type="dxa" w:w="5371"/>
             <w:tcBorders>
               <w:top w:val="none"/>
               <w:left w:val="none"/>
@@ -784,7 +784,7 @@
           </w:tcPr>
           <w:p>
             <w:pPr>
-              <w:spacing w:before="40" w:after="10" w:line="250" w:lineRule="auto"/>
+              <w:spacing w:before="60" w:after="10" w:line="269" w:lineRule="auto"/>
             </w:pPr>
             <w:r>
               <w:rPr>
@@ -793,13 +793,13 @@
                 <w:color w:val="000000"/>
                 <w:sz w:val="19"/>
               </w:rPr>
-              <w:t>Delivery Driver</w:t>
+              <w:t>Operations &amp; Shift Coordinator</w:t>
             </w:r>
           </w:p>
         </w:tc>
         <w:tc>
           <w:tcPr>
-            <w:tcW w:type="dxa" w:w="5429"/>
+            <w:tcW w:type="dxa" w:w="5371"/>
             <w:tcBorders>
               <w:top w:val="none"/>
               <w:left w:val="none"/>
@@ -815,144 +815,7 @@
           </w:tcPr>
           <w:p>
             <w:pPr>
-              <w:spacing w:before="40" w:after="10" w:line="250" w:lineRule="auto"/>
-              <w:jc w:val="right"/>
-            </w:pPr>
-            <w:r>
-              <w:rPr>
-                <w:rFonts w:ascii="Arial" w:hAnsi="Arial"/>
-                <w:b/>
-                <w:color w:val="000000"/>
-                <w:sz w:val="18"/>
-              </w:rPr>
-              <w:t>May 2025 – Present</w:t>
-            </w:r>
-          </w:p>
-        </w:tc>
-      </w:tr>
-    </w:tbl>
-    <w:p>
-      <w:pPr>
-        <w:spacing w:before="10" w:after="20" w:line="250" w:lineRule="auto"/>
-      </w:pPr>
-      <w:r>
-        <w:rPr>
-          <w:rFonts w:ascii="Arial" w:hAnsi="Arial"/>
-          <w:i/>
-          <w:color w:val="464646"/>
-          <w:sz w:val="18"/>
-        </w:rPr>
-        <w:t>DoorDash &amp; Uber — Tallahassee, FL</w:t>
-      </w:r>
-    </w:p>
-    <w:p>
-      <w:pPr>
-        <w:spacing w:before="10" w:after="20" w:line="252" w:lineRule="auto"/>
-        <w:ind w:left="259" w:hanging="259"/>
-      </w:pPr>
-      <w:r>
-        <w:rPr>
-          <w:rFonts w:ascii="Arial" w:hAnsi="Arial"/>
-          <w:b/>
-          <w:color w:val="000000"/>
-          <w:sz w:val="17"/>
-        </w:rPr>
-        <w:t xml:space="preserve">•  </w:t>
-      </w:r>
-      <w:r>
-        <w:rPr>
-          <w:rFonts w:ascii="Arial" w:hAnsi="Arial"/>
-          <w:color w:val="1E1E1E"/>
-          <w:sz w:val="17"/>
-        </w:rPr>
-        <w:t>Completed 800+ time-sensitive customer deliveries across peak hours, maintaining a 99% on-time completion rate and a 90%+ customer satisfaction rating.</w:t>
-      </w:r>
-    </w:p>
-    <w:p>
-      <w:pPr>
-        <w:spacing w:before="10" w:after="20" w:line="252" w:lineRule="auto"/>
-        <w:ind w:left="259" w:hanging="259"/>
-      </w:pPr>
-      <w:r>
-        <w:rPr>
-          <w:rFonts w:ascii="Arial" w:hAnsi="Arial"/>
-          <w:b/>
-          <w:color w:val="000000"/>
-          <w:sz w:val="17"/>
-        </w:rPr>
-        <w:t xml:space="preserve">•  </w:t>
-      </w:r>
-      <w:r>
-        <w:rPr>
-          <w:rFonts w:ascii="Arial" w:hAnsi="Arial"/>
-          <w:color w:val="1E1E1E"/>
-          <w:sz w:val="17"/>
-        </w:rPr>
-        <w:t>Managed route timing, transit constraints, and vehicle efficiency to maximize completed orders per hour and net earnings.</w:t>
-      </w:r>
-    </w:p>
-    <w:tbl>
-      <w:tblPr>
-        <w:tblW w:type="auto" w:w="0"/>
-        <w:jc w:val="center"/>
-        <w:tblLayout w:type="fixed"/>
-        <w:tblLook w:firstColumn="1" w:firstRow="1" w:lastColumn="0" w:lastRow="0" w:noHBand="0" w:noVBand="1" w:val="04A0"/>
-      </w:tblPr>
-      <w:tblGrid>
-        <w:gridCol w:w="7848"/>
-        <w:gridCol w:w="3010"/>
-      </w:tblGrid>
-      <w:tr>
-        <w:tc>
-          <w:tcPr>
-            <w:tcW w:type="dxa" w:w="5429"/>
-            <w:tcBorders>
-              <w:top w:val="none"/>
-              <w:left w:val="none"/>
-              <w:bottom w:val="none"/>
-              <w:right w:val="none"/>
-            </w:tcBorders>
-            <w:tcMar>
-              <w:top w:w="0" w:type="dxa"/>
-              <w:bottom w:w="0" w:type="dxa"/>
-              <w:left w:w="0" w:type="dxa"/>
-              <w:right w:w="0" w:type="dxa"/>
-            </w:tcMar>
-          </w:tcPr>
-          <w:p>
-            <w:pPr>
-              <w:spacing w:before="40" w:after="10" w:line="250" w:lineRule="auto"/>
-            </w:pPr>
-            <w:r>
-              <w:rPr>
-                <w:rFonts w:ascii="Arial" w:hAnsi="Arial"/>
-                <w:b/>
-                <w:color w:val="000000"/>
-                <w:sz w:val="19"/>
-              </w:rPr>
-              <w:t>Operations &amp; Shift Coordinator</w:t>
-            </w:r>
-          </w:p>
-        </w:tc>
-        <w:tc>
-          <w:tcPr>
-            <w:tcW w:type="dxa" w:w="5429"/>
-            <w:tcBorders>
-              <w:top w:val="none"/>
-              <w:left w:val="none"/>
-              <w:bottom w:val="none"/>
-              <w:right w:val="none"/>
-            </w:tcBorders>
-            <w:tcMar>
-              <w:top w:w="0" w:type="dxa"/>
-              <w:bottom w:w="0" w:type="dxa"/>
-              <w:left w:w="0" w:type="dxa"/>
-              <w:right w:w="0" w:type="dxa"/>
-            </w:tcMar>
-          </w:tcPr>
-          <w:p>
-            <w:pPr>
-              <w:spacing w:before="40" w:after="10" w:line="250" w:lineRule="auto"/>
+              <w:spacing w:before="60" w:after="10" w:line="269" w:lineRule="auto"/>
               <w:jc w:val="right"/>
             </w:pPr>
             <w:r>
@@ -970,7 +833,7 @@
     </w:tbl>
     <w:p>
       <w:pPr>
-        <w:spacing w:before="10" w:after="20" w:line="250" w:lineRule="auto"/>
+        <w:spacing w:before="10" w:after="30" w:line="269" w:lineRule="auto"/>
       </w:pPr>
       <w:r>
         <w:rPr>
@@ -984,7 +847,7 @@
     </w:p>
     <w:p>
       <w:pPr>
-        <w:spacing w:before="10" w:after="20" w:line="252" w:lineRule="auto"/>
+        <w:spacing w:before="20" w:after="36" w:line="269" w:lineRule="auto"/>
         <w:ind w:left="259" w:hanging="259"/>
       </w:pPr>
       <w:r>
@@ -1007,7 +870,7 @@
     </w:p>
     <w:p>
       <w:pPr>
-        <w:spacing w:before="10" w:after="20" w:line="252" w:lineRule="auto"/>
+        <w:spacing w:before="20" w:after="36" w:line="269" w:lineRule="auto"/>
         <w:ind w:left="259" w:hanging="259"/>
       </w:pPr>
       <w:r>
@@ -1030,7 +893,7 @@
     </w:p>
     <w:p>
       <w:pPr>
-        <w:spacing w:before="10" w:after="20" w:line="252" w:lineRule="auto"/>
+        <w:spacing w:before="20" w:after="36" w:line="269" w:lineRule="auto"/>
         <w:ind w:left="259" w:hanging="259"/>
       </w:pPr>
       <w:r>
@@ -1053,7 +916,7 @@
     </w:p>
     <w:p>
       <w:pPr>
-        <w:spacing w:before="10" w:after="20" w:line="252" w:lineRule="auto"/>
+        <w:spacing w:before="20" w:after="36" w:line="269" w:lineRule="auto"/>
         <w:ind w:left="259" w:hanging="259"/>
       </w:pPr>
       <w:r>
@@ -1076,7 +939,7 @@
     </w:p>
     <w:p>
       <w:pPr>
-        <w:spacing w:before="60" w:after="20" w:line="250" w:lineRule="auto"/>
+        <w:spacing w:before="90" w:after="30" w:line="269" w:lineRule="auto"/>
       </w:pPr>
       <w:r>
         <w:rPr>
@@ -1096,12 +959,12 @@
         <w:tblLook w:firstColumn="1" w:firstRow="1" w:lastColumn="0" w:lastRow="0" w:noHBand="0" w:noVBand="1" w:val="04A0"/>
       </w:tblPr>
       <w:tblGrid>
-        <w:gridCol w:w="10858"/>
+        <w:gridCol w:w="10742"/>
       </w:tblGrid>
       <w:tr>
         <w:tc>
           <w:tcPr>
-            <w:tcW w:type="dxa" w:w="10858"/>
+            <w:tcW w:type="dxa" w:w="10742"/>
             <w:tcBorders>
               <w:top w:val="none"/>
               <w:left w:val="none"/>
@@ -1136,13 +999,13 @@
         <w:tblLook w:firstColumn="1" w:firstRow="1" w:lastColumn="0" w:lastRow="0" w:noHBand="0" w:noVBand="1" w:val="04A0"/>
       </w:tblPr>
       <w:tblGrid>
-        <w:gridCol w:w="7848"/>
-        <w:gridCol w:w="3010"/>
+        <w:gridCol w:w="7776"/>
+        <w:gridCol w:w="2966"/>
       </w:tblGrid>
       <w:tr>
         <w:tc>
           <w:tcPr>
-            <w:tcW w:type="dxa" w:w="5429"/>
+            <w:tcW w:type="dxa" w:w="5371"/>
             <w:tcBorders>
               <w:top w:val="none"/>
               <w:left w:val="none"/>
@@ -1158,7 +1021,7 @@
           </w:tcPr>
           <w:p>
             <w:pPr>
-              <w:spacing w:before="40" w:after="10" w:line="250" w:lineRule="auto"/>
+              <w:spacing w:before="60" w:after="10" w:line="269" w:lineRule="auto"/>
             </w:pPr>
             <w:r>
               <w:rPr>
@@ -1173,7 +1036,7 @@
         </w:tc>
         <w:tc>
           <w:tcPr>
-            <w:tcW w:type="dxa" w:w="5429"/>
+            <w:tcW w:type="dxa" w:w="5371"/>
             <w:tcBorders>
               <w:top w:val="none"/>
               <w:left w:val="none"/>
@@ -1189,7 +1052,7 @@
           </w:tcPr>
           <w:p>
             <w:pPr>
-              <w:spacing w:before="40" w:after="10" w:line="250" w:lineRule="auto"/>
+              <w:spacing w:before="60" w:after="10" w:line="269" w:lineRule="auto"/>
               <w:jc w:val="right"/>
             </w:pPr>
             <w:r>
@@ -1207,7 +1070,7 @@
     </w:tbl>
     <w:p>
       <w:pPr>
-        <w:spacing w:before="10" w:after="20" w:line="250" w:lineRule="auto"/>
+        <w:spacing w:before="10" w:after="30" w:line="269" w:lineRule="auto"/>
       </w:pPr>
       <w:r>
         <w:rPr>
@@ -1221,7 +1084,7 @@
     </w:p>
     <w:p>
       <w:pPr>
-        <w:spacing w:before="10" w:after="20" w:line="252" w:lineRule="auto"/>
+        <w:spacing w:before="20" w:after="36" w:line="269" w:lineRule="auto"/>
         <w:ind w:left="259" w:hanging="259"/>
       </w:pPr>
       <w:r>
@@ -1253,7 +1116,7 @@
     </w:p>
     <w:p>
       <w:pPr>
-        <w:spacing w:before="10" w:after="20" w:line="252" w:lineRule="auto"/>
+        <w:spacing w:before="20" w:after="36" w:line="269" w:lineRule="auto"/>
         <w:ind w:left="259" w:hanging="259"/>
       </w:pPr>
       <w:r>
@@ -1285,7 +1148,7 @@
     </w:p>
     <w:sectPr>
       <w:pgSz w:w="12240" w:h="15840"/>
-      <w:pgMar w:top="504" w:right="691" w:bottom="504" w:left="691" w:header="720" w:footer="720" w:gutter="0"/>
+      <w:pgMar w:top="605" w:right="749" w:bottom="605" w:left="749" w:header="720" w:footer="720" w:gutter="0"/>
       <w:cols w:space="720"/>
       <w:docGrid w:linePitch="360"/>
     </w:sectPr>

</xml_diff>

<commit_message>
docs(resume): calibrate tight, balanced spacing across all sections with direct paragraph baseline underlines on 1 full page
</commit_message>
<xml_diff>
--- a/public/brand/Landen_Jackson_Master_Divider_Resume.docx
+++ b/public/brand/Landen_Jackson_Master_Divider_Resume.docx
@@ -34,8 +34,11 @@
     </w:p>
     <w:p>
       <w:pPr>
-        <w:spacing w:before="0" w:after="50" w:line="269" w:lineRule="auto"/>
+        <w:spacing w:before="0" w:after="60" w:line="269" w:lineRule="auto"/>
         <w:jc w:val="center"/>
+        <w:pBrd>
+          <w:bottom w:val="single" w:sz="10" w:space="2" w:color="000000"/>
+        </w:pBrd>
       </w:pPr>
       <w:r>
         <w:rPr>
@@ -46,49 +49,12 @@
         <w:t>Tallahassee, FL • (850) 459-9148 • jacksonlanden3986@gmail.com • linkedin.com/in/landenjackson • www.consultant-studio.app</w:t>
       </w:r>
     </w:p>
-    <w:tbl>
-      <w:tblPr>
-        <w:tblW w:type="auto" w:w="0"/>
-        <w:jc w:val="center"/>
-        <w:tblLayout w:type="fixed"/>
-        <w:tblLook w:firstColumn="1" w:firstRow="1" w:lastColumn="0" w:lastRow="0" w:noHBand="0" w:noVBand="1" w:val="04A0"/>
-      </w:tblPr>
-      <w:tblGrid>
-        <w:gridCol w:w="10742"/>
-      </w:tblGrid>
-      <w:tr>
-        <w:tc>
-          <w:tcPr>
-            <w:tcW w:type="dxa" w:w="10742"/>
-            <w:tcBorders>
-              <w:top w:val="none"/>
-              <w:left w:val="none"/>
-              <w:right w:val="none"/>
-              <w:bottom w:val="single" w:sz="10" w:space="0" w:color="000000"/>
-            </w:tcBorders>
-            <w:tcMar>
-              <w:top w:w="0" w:type="dxa"/>
-              <w:bottom w:w="0" w:type="dxa"/>
-              <w:left w:w="0" w:type="dxa"/>
-              <w:right w:w="0" w:type="dxa"/>
-            </w:tcMar>
-          </w:tcPr>
-          <w:p>
-            <w:pPr>
-              <w:spacing w:before="0" w:after="0" w:line="12" w:lineRule="auto"/>
-            </w:pPr>
-            <w:r>
-              <w:rPr>
-                <w:sz w:val="2"/>
-              </w:rPr>
-            </w:r>
-          </w:p>
-        </w:tc>
-      </w:tr>
-    </w:tbl>
     <w:p>
       <w:pPr>
-        <w:spacing w:before="90" w:after="30" w:line="269" w:lineRule="auto"/>
+        <w:spacing w:before="140" w:after="60" w:line="252" w:lineRule="auto"/>
+        <w:pBrd>
+          <w:bottom w:val="single" w:sz="8" w:space="1" w:color="000000"/>
+        </w:pBrd>
       </w:pPr>
       <w:r>
         <w:rPr>
@@ -100,49 +66,9 @@
         <w:t>EXECUTIVE PROFILE</w:t>
       </w:r>
     </w:p>
-    <w:tbl>
-      <w:tblPr>
-        <w:tblW w:type="auto" w:w="0"/>
-        <w:jc w:val="center"/>
-        <w:tblLayout w:type="fixed"/>
-        <w:tblLook w:firstColumn="1" w:firstRow="1" w:lastColumn="0" w:lastRow="0" w:noHBand="0" w:noVBand="1" w:val="04A0"/>
-      </w:tblPr>
-      <w:tblGrid>
-        <w:gridCol w:w="10742"/>
-      </w:tblGrid>
-      <w:tr>
-        <w:tc>
-          <w:tcPr>
-            <w:tcW w:type="dxa" w:w="10742"/>
-            <w:tcBorders>
-              <w:top w:val="none"/>
-              <w:left w:val="none"/>
-              <w:right w:val="none"/>
-              <w:bottom w:val="single" w:sz="10" w:space="0" w:color="000000"/>
-            </w:tcBorders>
-            <w:tcMar>
-              <w:top w:w="0" w:type="dxa"/>
-              <w:bottom w:w="0" w:type="dxa"/>
-              <w:left w:w="0" w:type="dxa"/>
-              <w:right w:w="0" w:type="dxa"/>
-            </w:tcMar>
-          </w:tcPr>
-          <w:p>
-            <w:pPr>
-              <w:spacing w:before="0" w:after="0" w:line="12" w:lineRule="auto"/>
-            </w:pPr>
-            <w:r>
-              <w:rPr>
-                <w:sz w:val="2"/>
-              </w:rPr>
-            </w:r>
-          </w:p>
-        </w:tc>
-      </w:tr>
-    </w:tbl>
     <w:p>
       <w:pPr>
-        <w:spacing w:before="40" w:after="60" w:line="274" w:lineRule="auto"/>
+        <w:spacing w:before="50" w:after="60" w:line="274" w:lineRule="auto"/>
       </w:pPr>
       <w:r>
         <w:rPr>
@@ -155,7 +81,10 @@
     </w:p>
     <w:p>
       <w:pPr>
-        <w:spacing w:before="90" w:after="30" w:line="269" w:lineRule="auto"/>
+        <w:spacing w:before="140" w:after="60" w:line="252" w:lineRule="auto"/>
+        <w:pBrd>
+          <w:bottom w:val="single" w:sz="8" w:space="1" w:color="000000"/>
+        </w:pBrd>
       </w:pPr>
       <w:r>
         <w:rPr>
@@ -167,50 +96,10 @@
         <w:t>CORE COMPETENCIES</w:t>
       </w:r>
     </w:p>
-    <w:tbl>
-      <w:tblPr>
-        <w:tblW w:type="auto" w:w="0"/>
-        <w:jc w:val="center"/>
-        <w:tblLayout w:type="fixed"/>
-        <w:tblLook w:firstColumn="1" w:firstRow="1" w:lastColumn="0" w:lastRow="0" w:noHBand="0" w:noVBand="1" w:val="04A0"/>
-      </w:tblPr>
-      <w:tblGrid>
-        <w:gridCol w:w="10742"/>
-      </w:tblGrid>
-      <w:tr>
-        <w:tc>
-          <w:tcPr>
-            <w:tcW w:type="dxa" w:w="10742"/>
-            <w:tcBorders>
-              <w:top w:val="none"/>
-              <w:left w:val="none"/>
-              <w:right w:val="none"/>
-              <w:bottom w:val="single" w:sz="10" w:space="0" w:color="000000"/>
-            </w:tcBorders>
-            <w:tcMar>
-              <w:top w:w="0" w:type="dxa"/>
-              <w:bottom w:w="0" w:type="dxa"/>
-              <w:left w:w="0" w:type="dxa"/>
-              <w:right w:w="0" w:type="dxa"/>
-            </w:tcMar>
-          </w:tcPr>
-          <w:p>
-            <w:pPr>
-              <w:spacing w:before="0" w:after="0" w:line="12" w:lineRule="auto"/>
-            </w:pPr>
-            <w:r>
-              <w:rPr>
-                <w:sz w:val="2"/>
-              </w:rPr>
-            </w:r>
-          </w:p>
-        </w:tc>
-      </w:tr>
-    </w:tbl>
     <w:p>
       <w:pPr>
-        <w:spacing w:before="20" w:after="36" w:line="269" w:lineRule="auto"/>
-        <w:ind w:left="259" w:hanging="259"/>
+        <w:spacing w:before="20" w:after="40" w:line="269" w:lineRule="auto"/>
+        <w:ind w:left="230" w:hanging="230"/>
       </w:pPr>
       <w:r>
         <w:rPr>
@@ -241,8 +130,8 @@
     </w:p>
     <w:p>
       <w:pPr>
-        <w:spacing w:before="20" w:after="36" w:line="269" w:lineRule="auto"/>
-        <w:ind w:left="259" w:hanging="259"/>
+        <w:spacing w:before="20" w:after="40" w:line="269" w:lineRule="auto"/>
+        <w:ind w:left="230" w:hanging="230"/>
       </w:pPr>
       <w:r>
         <w:rPr>
@@ -273,8 +162,8 @@
     </w:p>
     <w:p>
       <w:pPr>
-        <w:spacing w:before="20" w:after="36" w:line="269" w:lineRule="auto"/>
-        <w:ind w:left="259" w:hanging="259"/>
+        <w:spacing w:before="20" w:after="40" w:line="269" w:lineRule="auto"/>
+        <w:ind w:left="230" w:hanging="230"/>
       </w:pPr>
       <w:r>
         <w:rPr>
@@ -305,7 +194,10 @@
     </w:p>
     <w:p>
       <w:pPr>
-        <w:spacing w:before="90" w:after="30" w:line="269" w:lineRule="auto"/>
+        <w:spacing w:before="140" w:after="60" w:line="252" w:lineRule="auto"/>
+        <w:pBrd>
+          <w:bottom w:val="single" w:sz="8" w:space="1" w:color="000000"/>
+        </w:pBrd>
       </w:pPr>
       <w:r>
         <w:rPr>
@@ -325,53 +217,13 @@
         <w:tblLook w:firstColumn="1" w:firstRow="1" w:lastColumn="0" w:lastRow="0" w:noHBand="0" w:noVBand="1" w:val="04A0"/>
       </w:tblPr>
       <w:tblGrid>
-        <w:gridCol w:w="10742"/>
+        <w:gridCol w:w="7704"/>
+        <w:gridCol w:w="2952"/>
       </w:tblGrid>
       <w:tr>
         <w:tc>
           <w:tcPr>
-            <w:tcW w:type="dxa" w:w="10742"/>
-            <w:tcBorders>
-              <w:top w:val="none"/>
-              <w:left w:val="none"/>
-              <w:right w:val="none"/>
-              <w:bottom w:val="single" w:sz="10" w:space="0" w:color="000000"/>
-            </w:tcBorders>
-            <w:tcMar>
-              <w:top w:w="0" w:type="dxa"/>
-              <w:bottom w:w="0" w:type="dxa"/>
-              <w:left w:w="0" w:type="dxa"/>
-              <w:right w:w="0" w:type="dxa"/>
-            </w:tcMar>
-          </w:tcPr>
-          <w:p>
-            <w:pPr>
-              <w:spacing w:before="0" w:after="0" w:line="12" w:lineRule="auto"/>
-            </w:pPr>
-            <w:r>
-              <w:rPr>
-                <w:sz w:val="2"/>
-              </w:rPr>
-            </w:r>
-          </w:p>
-        </w:tc>
-      </w:tr>
-    </w:tbl>
-    <w:tbl>
-      <w:tblPr>
-        <w:tblW w:type="auto" w:w="0"/>
-        <w:jc w:val="center"/>
-        <w:tblLayout w:type="fixed"/>
-        <w:tblLook w:firstColumn="1" w:firstRow="1" w:lastColumn="0" w:lastRow="0" w:noHBand="0" w:noVBand="1" w:val="04A0"/>
-      </w:tblPr>
-      <w:tblGrid>
-        <w:gridCol w:w="7776"/>
-        <w:gridCol w:w="2966"/>
-      </w:tblGrid>
-      <w:tr>
-        <w:tc>
-          <w:tcPr>
-            <w:tcW w:type="dxa" w:w="5371"/>
+            <w:tcW w:type="dxa" w:w="5328"/>
             <w:tcBorders>
               <w:top w:val="none"/>
               <w:left w:val="none"/>
@@ -387,7 +239,7 @@
           </w:tcPr>
           <w:p>
             <w:pPr>
-              <w:spacing w:before="60" w:after="10" w:line="269" w:lineRule="auto"/>
+              <w:spacing w:before="70" w:after="10" w:line="252" w:lineRule="auto"/>
             </w:pPr>
             <w:r>
               <w:rPr>
@@ -402,7 +254,7 @@
         </w:tc>
         <w:tc>
           <w:tcPr>
-            <w:tcW w:type="dxa" w:w="5371"/>
+            <w:tcW w:type="dxa" w:w="5328"/>
             <w:tcBorders>
               <w:top w:val="none"/>
               <w:left w:val="none"/>
@@ -418,7 +270,7 @@
           </w:tcPr>
           <w:p>
             <w:pPr>
-              <w:spacing w:before="60" w:after="10" w:line="269" w:lineRule="auto"/>
+              <w:spacing w:before="70" w:after="10" w:line="252" w:lineRule="auto"/>
               <w:jc w:val="right"/>
             </w:pPr>
             <w:r>
@@ -436,7 +288,7 @@
     </w:tbl>
     <w:p>
       <w:pPr>
-        <w:spacing w:before="10" w:after="30" w:line="269" w:lineRule="auto"/>
+        <w:spacing w:before="10" w:after="40" w:line="252" w:lineRule="auto"/>
       </w:pPr>
       <w:r>
         <w:rPr>
@@ -450,8 +302,8 @@
     </w:p>
     <w:p>
       <w:pPr>
-        <w:spacing w:before="20" w:after="36" w:line="269" w:lineRule="auto"/>
-        <w:ind w:left="259" w:hanging="259"/>
+        <w:spacing w:before="20" w:after="40" w:line="269" w:lineRule="auto"/>
+        <w:ind w:left="230" w:hanging="230"/>
       </w:pPr>
       <w:r>
         <w:rPr>
@@ -473,8 +325,8 @@
     </w:p>
     <w:p>
       <w:pPr>
-        <w:spacing w:before="20" w:after="36" w:line="269" w:lineRule="auto"/>
-        <w:ind w:left="259" w:hanging="259"/>
+        <w:spacing w:before="20" w:after="40" w:line="269" w:lineRule="auto"/>
+        <w:ind w:left="230" w:hanging="230"/>
       </w:pPr>
       <w:r>
         <w:rPr>
@@ -496,8 +348,8 @@
     </w:p>
     <w:p>
       <w:pPr>
-        <w:spacing w:before="20" w:after="36" w:line="269" w:lineRule="auto"/>
-        <w:ind w:left="259" w:hanging="259"/>
+        <w:spacing w:before="20" w:after="40" w:line="269" w:lineRule="auto"/>
+        <w:ind w:left="230" w:hanging="230"/>
       </w:pPr>
       <w:r>
         <w:rPr>
@@ -519,7 +371,10 @@
     </w:p>
     <w:p>
       <w:pPr>
-        <w:spacing w:before="90" w:after="30" w:line="269" w:lineRule="auto"/>
+        <w:spacing w:before="140" w:after="60" w:line="252" w:lineRule="auto"/>
+        <w:pBrd>
+          <w:bottom w:val="single" w:sz="8" w:space="1" w:color="000000"/>
+        </w:pBrd>
       </w:pPr>
       <w:r>
         <w:rPr>
@@ -539,53 +394,13 @@
         <w:tblLook w:firstColumn="1" w:firstRow="1" w:lastColumn="0" w:lastRow="0" w:noHBand="0" w:noVBand="1" w:val="04A0"/>
       </w:tblPr>
       <w:tblGrid>
-        <w:gridCol w:w="10742"/>
+        <w:gridCol w:w="7704"/>
+        <w:gridCol w:w="2952"/>
       </w:tblGrid>
       <w:tr>
         <w:tc>
           <w:tcPr>
-            <w:tcW w:type="dxa" w:w="10742"/>
-            <w:tcBorders>
-              <w:top w:val="none"/>
-              <w:left w:val="none"/>
-              <w:right w:val="none"/>
-              <w:bottom w:val="single" w:sz="10" w:space="0" w:color="000000"/>
-            </w:tcBorders>
-            <w:tcMar>
-              <w:top w:w="0" w:type="dxa"/>
-              <w:bottom w:w="0" w:type="dxa"/>
-              <w:left w:w="0" w:type="dxa"/>
-              <w:right w:w="0" w:type="dxa"/>
-            </w:tcMar>
-          </w:tcPr>
-          <w:p>
-            <w:pPr>
-              <w:spacing w:before="0" w:after="0" w:line="12" w:lineRule="auto"/>
-            </w:pPr>
-            <w:r>
-              <w:rPr>
-                <w:sz w:val="2"/>
-              </w:rPr>
-            </w:r>
-          </w:p>
-        </w:tc>
-      </w:tr>
-    </w:tbl>
-    <w:tbl>
-      <w:tblPr>
-        <w:tblW w:type="auto" w:w="0"/>
-        <w:jc w:val="center"/>
-        <w:tblLayout w:type="fixed"/>
-        <w:tblLook w:firstColumn="1" w:firstRow="1" w:lastColumn="0" w:lastRow="0" w:noHBand="0" w:noVBand="1" w:val="04A0"/>
-      </w:tblPr>
-      <w:tblGrid>
-        <w:gridCol w:w="7776"/>
-        <w:gridCol w:w="2966"/>
-      </w:tblGrid>
-      <w:tr>
-        <w:tc>
-          <w:tcPr>
-            <w:tcW w:type="dxa" w:w="5371"/>
+            <w:tcW w:type="dxa" w:w="5328"/>
             <w:tcBorders>
               <w:top w:val="none"/>
               <w:left w:val="none"/>
@@ -601,7 +416,7 @@
           </w:tcPr>
           <w:p>
             <w:pPr>
-              <w:spacing w:before="60" w:after="10" w:line="269" w:lineRule="auto"/>
+              <w:spacing w:before="70" w:after="10" w:line="252" w:lineRule="auto"/>
             </w:pPr>
             <w:r>
               <w:rPr>
@@ -616,7 +431,7 @@
         </w:tc>
         <w:tc>
           <w:tcPr>
-            <w:tcW w:type="dxa" w:w="5371"/>
+            <w:tcW w:type="dxa" w:w="5328"/>
             <w:tcBorders>
               <w:top w:val="none"/>
               <w:left w:val="none"/>
@@ -632,7 +447,7 @@
           </w:tcPr>
           <w:p>
             <w:pPr>
-              <w:spacing w:before="60" w:after="10" w:line="269" w:lineRule="auto"/>
+              <w:spacing w:before="70" w:after="10" w:line="252" w:lineRule="auto"/>
               <w:jc w:val="right"/>
             </w:pPr>
             <w:r>
@@ -650,7 +465,7 @@
     </w:tbl>
     <w:p>
       <w:pPr>
-        <w:spacing w:before="10" w:after="30" w:line="269" w:lineRule="auto"/>
+        <w:spacing w:before="10" w:after="40" w:line="252" w:lineRule="auto"/>
       </w:pPr>
       <w:r>
         <w:rPr>
@@ -664,8 +479,8 @@
     </w:p>
     <w:p>
       <w:pPr>
-        <w:spacing w:before="20" w:after="36" w:line="269" w:lineRule="auto"/>
-        <w:ind w:left="259" w:hanging="259"/>
+        <w:spacing w:before="20" w:after="40" w:line="269" w:lineRule="auto"/>
+        <w:ind w:left="230" w:hanging="230"/>
       </w:pPr>
       <w:r>
         <w:rPr>
@@ -687,8 +502,8 @@
     </w:p>
     <w:p>
       <w:pPr>
-        <w:spacing w:before="20" w:after="36" w:line="269" w:lineRule="auto"/>
-        <w:ind w:left="259" w:hanging="259"/>
+        <w:spacing w:before="20" w:after="40" w:line="269" w:lineRule="auto"/>
+        <w:ind w:left="230" w:hanging="230"/>
       </w:pPr>
       <w:r>
         <w:rPr>
@@ -710,8 +525,8 @@
     </w:p>
     <w:p>
       <w:pPr>
-        <w:spacing w:before="20" w:after="36" w:line="269" w:lineRule="auto"/>
-        <w:ind w:left="259" w:hanging="259"/>
+        <w:spacing w:before="20" w:after="40" w:line="269" w:lineRule="auto"/>
+        <w:ind w:left="230" w:hanging="230"/>
       </w:pPr>
       <w:r>
         <w:rPr>
@@ -733,8 +548,8 @@
     </w:p>
     <w:p>
       <w:pPr>
-        <w:spacing w:before="20" w:after="36" w:line="269" w:lineRule="auto"/>
-        <w:ind w:left="259" w:hanging="259"/>
+        <w:spacing w:before="20" w:after="40" w:line="269" w:lineRule="auto"/>
+        <w:ind w:left="230" w:hanging="230"/>
       </w:pPr>
       <w:r>
         <w:rPr>
@@ -762,13 +577,13 @@
         <w:tblLook w:firstColumn="1" w:firstRow="1" w:lastColumn="0" w:lastRow="0" w:noHBand="0" w:noVBand="1" w:val="04A0"/>
       </w:tblPr>
       <w:tblGrid>
-        <w:gridCol w:w="7776"/>
-        <w:gridCol w:w="2966"/>
+        <w:gridCol w:w="7704"/>
+        <w:gridCol w:w="2952"/>
       </w:tblGrid>
       <w:tr>
         <w:tc>
           <w:tcPr>
-            <w:tcW w:type="dxa" w:w="5371"/>
+            <w:tcW w:type="dxa" w:w="5328"/>
             <w:tcBorders>
               <w:top w:val="none"/>
               <w:left w:val="none"/>
@@ -784,7 +599,7 @@
           </w:tcPr>
           <w:p>
             <w:pPr>
-              <w:spacing w:before="60" w:after="10" w:line="269" w:lineRule="auto"/>
+              <w:spacing w:before="70" w:after="10" w:line="252" w:lineRule="auto"/>
             </w:pPr>
             <w:r>
               <w:rPr>
@@ -799,7 +614,7 @@
         </w:tc>
         <w:tc>
           <w:tcPr>
-            <w:tcW w:type="dxa" w:w="5371"/>
+            <w:tcW w:type="dxa" w:w="5328"/>
             <w:tcBorders>
               <w:top w:val="none"/>
               <w:left w:val="none"/>
@@ -815,7 +630,7 @@
           </w:tcPr>
           <w:p>
             <w:pPr>
-              <w:spacing w:before="60" w:after="10" w:line="269" w:lineRule="auto"/>
+              <w:spacing w:before="70" w:after="10" w:line="252" w:lineRule="auto"/>
               <w:jc w:val="right"/>
             </w:pPr>
             <w:r>
@@ -833,7 +648,7 @@
     </w:tbl>
     <w:p>
       <w:pPr>
-        <w:spacing w:before="10" w:after="30" w:line="269" w:lineRule="auto"/>
+        <w:spacing w:before="10" w:after="40" w:line="252" w:lineRule="auto"/>
       </w:pPr>
       <w:r>
         <w:rPr>
@@ -847,8 +662,8 @@
     </w:p>
     <w:p>
       <w:pPr>
-        <w:spacing w:before="20" w:after="36" w:line="269" w:lineRule="auto"/>
-        <w:ind w:left="259" w:hanging="259"/>
+        <w:spacing w:before="20" w:after="40" w:line="269" w:lineRule="auto"/>
+        <w:ind w:left="230" w:hanging="230"/>
       </w:pPr>
       <w:r>
         <w:rPr>
@@ -870,8 +685,8 @@
     </w:p>
     <w:p>
       <w:pPr>
-        <w:spacing w:before="20" w:after="36" w:line="269" w:lineRule="auto"/>
-        <w:ind w:left="259" w:hanging="259"/>
+        <w:spacing w:before="20" w:after="40" w:line="269" w:lineRule="auto"/>
+        <w:ind w:left="230" w:hanging="230"/>
       </w:pPr>
       <w:r>
         <w:rPr>
@@ -893,8 +708,8 @@
     </w:p>
     <w:p>
       <w:pPr>
-        <w:spacing w:before="20" w:after="36" w:line="269" w:lineRule="auto"/>
-        <w:ind w:left="259" w:hanging="259"/>
+        <w:spacing w:before="20" w:after="40" w:line="269" w:lineRule="auto"/>
+        <w:ind w:left="230" w:hanging="230"/>
       </w:pPr>
       <w:r>
         <w:rPr>
@@ -916,8 +731,8 @@
     </w:p>
     <w:p>
       <w:pPr>
-        <w:spacing w:before="20" w:after="36" w:line="269" w:lineRule="auto"/>
-        <w:ind w:left="259" w:hanging="259"/>
+        <w:spacing w:before="20" w:after="40" w:line="269" w:lineRule="auto"/>
+        <w:ind w:left="230" w:hanging="230"/>
       </w:pPr>
       <w:r>
         <w:rPr>
@@ -939,7 +754,10 @@
     </w:p>
     <w:p>
       <w:pPr>
-        <w:spacing w:before="90" w:after="30" w:line="269" w:lineRule="auto"/>
+        <w:spacing w:before="140" w:after="60" w:line="252" w:lineRule="auto"/>
+        <w:pBrd>
+          <w:bottom w:val="single" w:sz="8" w:space="1" w:color="000000"/>
+        </w:pBrd>
       </w:pPr>
       <w:r>
         <w:rPr>
@@ -959,53 +777,13 @@
         <w:tblLook w:firstColumn="1" w:firstRow="1" w:lastColumn="0" w:lastRow="0" w:noHBand="0" w:noVBand="1" w:val="04A0"/>
       </w:tblPr>
       <w:tblGrid>
-        <w:gridCol w:w="10742"/>
+        <w:gridCol w:w="7704"/>
+        <w:gridCol w:w="2952"/>
       </w:tblGrid>
       <w:tr>
         <w:tc>
           <w:tcPr>
-            <w:tcW w:type="dxa" w:w="10742"/>
-            <w:tcBorders>
-              <w:top w:val="none"/>
-              <w:left w:val="none"/>
-              <w:right w:val="none"/>
-              <w:bottom w:val="single" w:sz="10" w:space="0" w:color="000000"/>
-            </w:tcBorders>
-            <w:tcMar>
-              <w:top w:w="0" w:type="dxa"/>
-              <w:bottom w:w="0" w:type="dxa"/>
-              <w:left w:w="0" w:type="dxa"/>
-              <w:right w:w="0" w:type="dxa"/>
-            </w:tcMar>
-          </w:tcPr>
-          <w:p>
-            <w:pPr>
-              <w:spacing w:before="0" w:after="0" w:line="12" w:lineRule="auto"/>
-            </w:pPr>
-            <w:r>
-              <w:rPr>
-                <w:sz w:val="2"/>
-              </w:rPr>
-            </w:r>
-          </w:p>
-        </w:tc>
-      </w:tr>
-    </w:tbl>
-    <w:tbl>
-      <w:tblPr>
-        <w:tblW w:type="auto" w:w="0"/>
-        <w:jc w:val="center"/>
-        <w:tblLayout w:type="fixed"/>
-        <w:tblLook w:firstColumn="1" w:firstRow="1" w:lastColumn="0" w:lastRow="0" w:noHBand="0" w:noVBand="1" w:val="04A0"/>
-      </w:tblPr>
-      <w:tblGrid>
-        <w:gridCol w:w="7776"/>
-        <w:gridCol w:w="2966"/>
-      </w:tblGrid>
-      <w:tr>
-        <w:tc>
-          <w:tcPr>
-            <w:tcW w:type="dxa" w:w="5371"/>
+            <w:tcW w:type="dxa" w:w="5328"/>
             <w:tcBorders>
               <w:top w:val="none"/>
               <w:left w:val="none"/>
@@ -1021,7 +799,7 @@
           </w:tcPr>
           <w:p>
             <w:pPr>
-              <w:spacing w:before="60" w:after="10" w:line="269" w:lineRule="auto"/>
+              <w:spacing w:before="70" w:after="10" w:line="252" w:lineRule="auto"/>
             </w:pPr>
             <w:r>
               <w:rPr>
@@ -1036,7 +814,7 @@
         </w:tc>
         <w:tc>
           <w:tcPr>
-            <w:tcW w:type="dxa" w:w="5371"/>
+            <w:tcW w:type="dxa" w:w="5328"/>
             <w:tcBorders>
               <w:top w:val="none"/>
               <w:left w:val="none"/>
@@ -1052,7 +830,7 @@
           </w:tcPr>
           <w:p>
             <w:pPr>
-              <w:spacing w:before="60" w:after="10" w:line="269" w:lineRule="auto"/>
+              <w:spacing w:before="70" w:after="10" w:line="252" w:lineRule="auto"/>
               <w:jc w:val="right"/>
             </w:pPr>
             <w:r>
@@ -1070,7 +848,7 @@
     </w:tbl>
     <w:p>
       <w:pPr>
-        <w:spacing w:before="10" w:after="30" w:line="269" w:lineRule="auto"/>
+        <w:spacing w:before="10" w:after="40" w:line="252" w:lineRule="auto"/>
       </w:pPr>
       <w:r>
         <w:rPr>
@@ -1084,8 +862,8 @@
     </w:p>
     <w:p>
       <w:pPr>
-        <w:spacing w:before="20" w:after="36" w:line="269" w:lineRule="auto"/>
-        <w:ind w:left="259" w:hanging="259"/>
+        <w:spacing w:before="20" w:after="40" w:line="269" w:lineRule="auto"/>
+        <w:ind w:left="230" w:hanging="230"/>
       </w:pPr>
       <w:r>
         <w:rPr>
@@ -1116,8 +894,8 @@
     </w:p>
     <w:p>
       <w:pPr>
-        <w:spacing w:before="20" w:after="36" w:line="269" w:lineRule="auto"/>
-        <w:ind w:left="259" w:hanging="259"/>
+        <w:spacing w:before="20" w:after="40" w:line="269" w:lineRule="auto"/>
+        <w:ind w:left="230" w:hanging="230"/>
       </w:pPr>
       <w:r>
         <w:rPr>
@@ -1148,7 +926,7 @@
     </w:p>
     <w:sectPr>
       <w:pgSz w:w="12240" w:h="15840"/>
-      <w:pgMar w:top="605" w:right="749" w:bottom="605" w:left="749" w:header="720" w:footer="720" w:gutter="0"/>
+      <w:pgMar w:top="720" w:right="792" w:bottom="720" w:left="792" w:header="720" w:footer="720" w:gutter="0"/>
       <w:cols w:space="720"/>
       <w:docGrid w:linePitch="360"/>
     </w:sectPr>

</xml_diff>